<commit_message>
new version at 8:33
</commit_message>
<xml_diff>
--- a/learnGit.docx
+++ b/learnGit.docx
@@ -5,6 +5,11 @@
     <w:p>
       <w:r>
         <w:t>20:21 – first commit</w:t>
+      </w:r>
+    </w:p>
+    <w:p>
+      <w:r>
+        <w:t xml:space="preserve">20:32 – </w:t>
       </w:r>
       <w:bookmarkStart w:id="0" w:name="_GoBack"/>
       <w:bookmarkEnd w:id="0"/>

</xml_diff>